<commit_message>
AIB rigor pass (ChatGPT feedback): validation≠differentiation≠premium framing, dedicated 'Why this thesis could fail' anti-thesis section, calibrated predictions (confidence·basis), overstatement trims (OX40L disease-mod, TSHR hypothesis, dual-alarmin COPD, FcRn dosing-floor) across all 4 areas
</commit_message>
<xml_diff>
--- a/AIB_FcRn_Albumin_autoimmune_v1.docx
+++ b/AIB_FcRn_Albumin_autoimmune_v1.docx
@@ -407,6 +407,83 @@
         </w:tc>
       </w:tr>
     </w:tbl>
+    <w:tbl>
+      <w:tblPr>
+        <w:tblW w:type="dxa" w:w="9360"/>
+        <w:tblBorders>
+          <w:top w:val="single" w:color="auto" w:sz="4"/>
+          <w:left w:val="single" w:color="auto" w:sz="4"/>
+          <w:bottom w:val="single" w:color="auto" w:sz="4"/>
+          <w:right w:val="single" w:color="auto" w:sz="4"/>
+          <w:insideH w:val="single" w:color="auto" w:sz="4"/>
+          <w:insideV w:val="single" w:color="auto" w:sz="4"/>
+        </w:tblBorders>
+      </w:tblPr>
+      <w:tblGrid>
+        <w:gridCol w:w="9360"/>
+      </w:tblGrid>
+      <w:tr>
+        <w:tc>
+          <w:tcPr>
+            <w:tcBorders>
+              <w:top w:val="none"/>
+              <w:left w:val="single" w:color="1A3F8F" w:sz="18"/>
+              <w:bottom w:val="none"/>
+              <w:right w:val="none"/>
+            </w:tcBorders>
+            <w:shd w:fill="EEF4FB" w:val="clear"/>
+            <w:tcMar>
+              <w:top w:type="dxa" w:w="80"/>
+              <w:left w:type="dxa" w:w="150"/>
+              <w:bottom w:type="dxa" w:w="80"/>
+              <w:right w:type="dxa" w:w="130"/>
+            </w:tcMar>
+          </w:tcPr>
+          <w:p>
+            <w:r>
+              <w:rPr>
+                <w:b/>
+                <w:bCs/>
+              </w:rPr>
+              <w:t xml:space="preserve">Validation ≠ differentiation ≠ premium — and beware the dosing floor. </w:t>
+            </w:r>
+            <w:r>
+              <w:t xml:space="preserve">FcRn blockade is validated and efficacy is commoditized; the only differentiation left is convenience and breadth. But convenience is </w:t>
+            </w:r>
+            <w:r>
+              <w:rPr>
+                <w:b/>
+                <w:bCs/>
+              </w:rPr>
+              <w:t xml:space="preserve">not</w:t>
+            </w:r>
+            <w:r>
+              <w:t xml:space="preserve"> guaranteed by half-life alone. The real question is </w:t>
+            </w:r>
+            <w:r>
+              <w:rPr>
+                <w:b/>
+                <w:bCs/>
+              </w:rPr>
+              <w:t xml:space="preserve">what minimum FcRn occupancy (and depth of IgG suppression) sustains clinical benefit</w:t>
+            </w:r>
+            <w:r>
+              <w:t xml:space="preserve">: if efficacy requires periodic deep IgG troughs, FcRn biology imposes a </w:t>
+            </w:r>
+            <w:r>
+              <w:rPr>
+                <w:b/>
+                <w:bCs/>
+              </w:rPr>
+              <w:t xml:space="preserve">dosing floor</w:t>
+            </w:r>
+            <w:r>
+              <w:t xml:space="preserve"> that a longer half-life cannot lift. A premium requires clinical proof that deep-enough suppression is maintained between infrequent doses — a pharmacodynamic question, not a half-life one.</w:t>
+            </w:r>
+          </w:p>
+        </w:tc>
+      </w:tr>
+    </w:tbl>
     <w:p>
       <w:pPr>
         <w:pStyle w:val="Heading1"/>
@@ -933,7 +1010,7 @@
       <w:r>
         <w:t xml:space="preserve">With three approved FcRn inhibitors at similar efficacy, the class has moved from 'does it work?' to 'how convenient and how broad?' </w:t>
       </w:r>
-      <w:hyperlink w:history="1" r:id="rIdfxjikgpxdglfklyxljeat">
+      <w:hyperlink w:history="1" r:id="rIdaogbgwjmt7qifimfgosmk">
         <w:r>
           <w:rPr>
             <w:rStyle w:val="Hyperlink"/>
@@ -944,7 +1021,7 @@
       <w:r>
         <w:t xml:space="preserve">; the live battleground is </w:t>
       </w:r>
-      <w:hyperlink w:history="1" r:id="rIdbvgtshy5-ntoju403u3g2">
+      <w:hyperlink w:history="1" r:id="rIdf8iphkiwisd-sw5epvxdg">
         <w:r>
           <w:rPr>
             <w:rStyle w:val="Hyperlink"/>
@@ -953,7 +1030,17 @@
         </w:r>
       </w:hyperlink>
       <w:r>
-        <w:t xml:space="preserve"> and indication expansion. A half-life-extended FcRn inhibitor that converts weekly dosing to monthly is the most concrete differentiation available — and the explicit rationale behind albumin-arm and other extended-half-life designs.</w:t>
+        <w:t xml:space="preserve"> and indication expansion. A half-life-extended FcRn inhibitor that converts weekly dosing to monthly is the most concrete differentiation available — and the explicit rationale behind albumin-arm and other extended-half-life designs. The most important next-generation competitor on this axis is </w:t>
+      </w:r>
+      <w:r>
+        <w:rPr>
+          <w:b/>
+          <w:bCs/>
+        </w:rPr>
+        <w:t xml:space="preserve">Immunovant's IMVT-1402</w:t>
+      </w:r>
+      <w:r>
+        <w:t xml:space="preserve">, engineered for deep IgG lowering with a cleaner albumin/lipid profile than batoclimab and SC dosing — it is already pursuing the convenience differentiation, and is the benchmark a new entrant must beat, not just the approved agents.</w:t>
       </w:r>
     </w:p>
     <w:p>
@@ -971,7 +1058,7 @@
       <w:r>
         <w:t xml:space="preserve">Generalized myasthenia gravis is the anchor indication: autoantibodies (mostly against the acetylcholine receptor, </w:t>
       </w:r>
-      <w:hyperlink w:history="1" r:id="rIda6s14j4ytzwny7_o90-p7">
+      <w:hyperlink w:history="1" r:id="rIdsrem-eals64ju2nh4rbfd">
         <w:r>
           <w:rPr>
             <w:rStyle w:val="Hyperlink"/>
@@ -1412,7 +1499,7 @@
       <w:r>
         <w:t xml:space="preserve">FcRn (the </w:t>
       </w:r>
-      <w:hyperlink w:history="1" r:id="rIdlsbhl_qk4c-j9ose5yxin">
+      <w:hyperlink w:history="1" r:id="rId5cm9ri28udvhqs_tmnmlg">
         <w:r>
           <w:rPr>
             <w:rStyle w:val="Hyperlink"/>
@@ -1459,7 +1546,7 @@
       <w:r>
         <w:t xml:space="preserve">The mechanism is decisively validated — </w:t>
       </w:r>
-      <w:hyperlink w:history="1" r:id="rIdjgx0xidpdn28jcn17btg4">
+      <w:hyperlink w:history="1" r:id="rIdag8xzpgnjyhcw1zsjc92n">
         <w:r>
           <w:rPr>
             <w:rStyle w:val="Hyperlink"/>
@@ -1470,7 +1557,7 @@
       <w:r>
         <w:t xml:space="preserve">, matched by rozanolixizumab and nipocalimab, and expanding into CIDP, ITP and wAIHA. What is not solved is convenience: every approved agent requires </w:t>
       </w:r>
-      <w:hyperlink w:history="1" r:id="rIdagt0gslm9ypvnn5dhb45k">
+      <w:hyperlink w:history="1" r:id="rIdhyociwoh5xzrjm77kvtqd">
         <w:r>
           <w:rPr>
             <w:rStyle w:val="Hyperlink"/>
@@ -2628,7 +2715,7 @@
             <w:r>
               <w:t xml:space="preserve">The approved standard is </w:t>
             </w:r>
-            <w:hyperlink w:history="1" r:id="rIdmepxr6oy_50wham5dbza0">
+            <w:hyperlink w:history="1" r:id="rId6n8q4qt5nctv_9fyxqtfq">
               <w:r>
                 <w:rPr>
                   <w:rStyle w:val="Hyperlink"/>
@@ -4309,7 +4396,7 @@
         </w:rPr>
         <w:t xml:space="preserve">Indication-specific failure is real. </w:t>
       </w:r>
-      <w:hyperlink w:history="1" r:id="rIduq4hujphobe_hls091ruj">
+      <w:hyperlink w:history="1" r:id="rIdkduq66gnzfsc4uu7w49wt">
         <w:r>
           <w:rPr>
             <w:rStyle w:val="Hyperlink"/>
@@ -5511,7 +5598,7 @@
       <w:r>
         <w:t xml:space="preserve">FcRn inhibitors carry high annual costs typical of rare-disease biologics, and the </w:t>
       </w:r>
-      <w:hyperlink w:history="1" r:id="rIdd6bppgvednocqvh1r9ad0">
+      <w:hyperlink w:history="1" r:id="rIda3-cqcng67-rwjchon2lz">
         <w:r>
           <w:rPr>
             <w:rStyle w:val="Hyperlink"/>
@@ -7705,7 +7792,15 @@
         <w:pStyle w:val="Heading1"/>
       </w:pPr>
       <w:r>
-        <w:t xml:space="preserve">13 · Standing predictions</w:t>
+        <w:t xml:space="preserve">Why this thesis could fail</w:t>
+      </w:r>
+    </w:p>
+    <w:p>
+      <w:pPr>
+        <w:spacing w:after="120"/>
+      </w:pPr>
+      <w:r>
+        <w:t xml:space="preserve">The anti-thesis — the reasons a half-life-extended FcRn inhibitor may not deliver the convenience leap:</w:t>
       </w:r>
     </w:p>
     <w:tbl>
@@ -7721,10 +7816,8 @@
         </w:tblBorders>
       </w:tblPr>
       <w:tblGrid>
-        <w:gridCol w:w="4600"/>
-        <w:gridCol w:w="1500"/>
-        <w:gridCol w:w="1500"/>
-        <w:gridCol w:w="1760"/>
+        <w:gridCol w:w="2550"/>
+        <w:gridCol w:w="6810"/>
       </w:tblGrid>
       <w:tr>
         <w:trPr>
@@ -7732,7 +7825,7 @@
         </w:trPr>
         <w:tc>
           <w:tcPr>
-            <w:tcW w:type="dxa" w:w="4600"/>
+            <w:tcW w:type="dxa" w:w="2550"/>
             <w:tcBorders>
               <w:top w:val="single" w:color="1A3F8F" w:sz="1"/>
               <w:left w:val="single" w:color="1A3F8F" w:sz="1"/>
@@ -7759,13 +7852,13 @@
                 <w:sz w:val="17"/>
                 <w:szCs w:val="17"/>
               </w:rPr>
-              <w:t xml:space="preserve">Prediction</w:t>
-            </w:r>
-          </w:p>
-        </w:tc>
-        <w:tc>
-          <w:tcPr>
-            <w:tcW w:type="dxa" w:w="1500"/>
+              <w:t xml:space="preserve">Failure mode</w:t>
+            </w:r>
+          </w:p>
+        </w:tc>
+        <w:tc>
+          <w:tcPr>
+            <w:tcW w:type="dxa" w:w="6810"/>
             <w:tcBorders>
               <w:top w:val="single" w:color="1A3F8F" w:sz="1"/>
               <w:left w:val="single" w:color="1A3F8F" w:sz="1"/>
@@ -7792,73 +7885,7 @@
                 <w:sz w:val="17"/>
                 <w:szCs w:val="17"/>
               </w:rPr>
-              <w:t xml:space="preserve">Type</w:t>
-            </w:r>
-          </w:p>
-        </w:tc>
-        <w:tc>
-          <w:tcPr>
-            <w:tcW w:type="dxa" w:w="1500"/>
-            <w:tcBorders>
-              <w:top w:val="single" w:color="1A3F8F" w:sz="1"/>
-              <w:left w:val="single" w:color="1A3F8F" w:sz="1"/>
-              <w:bottom w:val="single" w:color="1A3F8F" w:sz="1"/>
-              <w:right w:val="single" w:color="1A3F8F" w:sz="1"/>
-            </w:tcBorders>
-            <w:shd w:fill="1A3F8F" w:val="clear"/>
-            <w:tcMar>
-              <w:top w:type="dxa" w:w="46"/>
-              <w:left w:type="dxa" w:w="94"/>
-              <w:bottom w:type="dxa" w:w="46"/>
-              <w:right w:type="dxa" w:w="94"/>
-            </w:tcMar>
-          </w:tcPr>
-          <w:p>
-            <w:pPr>
-              <w:jc w:val="left"/>
-            </w:pPr>
-            <w:r>
-              <w:rPr>
-                <w:b/>
-                <w:bCs/>
-                <w:color w:val="FFFFFF"/>
-                <w:sz w:val="17"/>
-                <w:szCs w:val="17"/>
-              </w:rPr>
-              <w:t xml:space="preserve">Estimate</w:t>
-            </w:r>
-          </w:p>
-        </w:tc>
-        <w:tc>
-          <w:tcPr>
-            <w:tcW w:type="dxa" w:w="1760"/>
-            <w:tcBorders>
-              <w:top w:val="single" w:color="1A3F8F" w:sz="1"/>
-              <w:left w:val="single" w:color="1A3F8F" w:sz="1"/>
-              <w:bottom w:val="single" w:color="1A3F8F" w:sz="1"/>
-              <w:right w:val="single" w:color="1A3F8F" w:sz="1"/>
-            </w:tcBorders>
-            <w:shd w:fill="1A3F8F" w:val="clear"/>
-            <w:tcMar>
-              <w:top w:type="dxa" w:w="46"/>
-              <w:left w:type="dxa" w:w="94"/>
-              <w:bottom w:type="dxa" w:w="46"/>
-              <w:right w:type="dxa" w:w="94"/>
-            </w:tcMar>
-          </w:tcPr>
-          <w:p>
-            <w:pPr>
-              <w:jc w:val="left"/>
-            </w:pPr>
-            <w:r>
-              <w:rPr>
-                <w:b/>
-                <w:bCs/>
-                <w:color w:val="FFFFFF"/>
-                <w:sz w:val="17"/>
-                <w:szCs w:val="17"/>
-              </w:rPr>
-              <w:t xml:space="preserve">Resolves (range)</w:t>
+              <w:t xml:space="preserve">Why it could happen</w:t>
             </w:r>
           </w:p>
         </w:tc>
@@ -7869,133 +7896,64 @@
         </w:trPr>
         <w:tc>
           <w:tcPr>
-            <w:tcW w:type="dxa" w:w="4600"/>
-            <w:tcBorders>
-              <w:top w:val="single" w:color="D6DEEA" w:sz="1"/>
-              <w:left w:val="single" w:color="D6DEEA" w:sz="1"/>
-              <w:bottom w:val="single" w:color="D6DEEA" w:sz="1"/>
-              <w:right w:val="single" w:color="D6DEEA" w:sz="1"/>
-            </w:tcBorders>
-            <w:shd w:fill="FFFFFF" w:val="clear"/>
-            <w:tcMar>
-              <w:top w:type="dxa" w:w="46"/>
-              <w:left w:type="dxa" w:w="94"/>
-              <w:bottom w:type="dxa" w:w="46"/>
-              <w:right w:type="dxa" w:w="94"/>
-            </w:tcMar>
-          </w:tcPr>
-          <w:p>
-            <w:pPr>
-              <w:jc w:val="left"/>
-            </w:pPr>
-            <w:r>
-              <w:rPr>
-                <w:b w:val="false"/>
-                <w:bCs w:val="false"/>
-                <w:color w:val="14274A"/>
-                <w:sz w:val="17"/>
-                <w:szCs w:val="17"/>
-              </w:rPr>
-              <w:t xml:space="preserve">Nipocalimab is approved in wAIHA</w:t>
-            </w:r>
-          </w:p>
-        </w:tc>
-        <w:tc>
-          <w:tcPr>
-            <w:tcW w:type="dxa" w:w="1500"/>
-            <w:tcBorders>
-              <w:top w:val="single" w:color="D6DEEA" w:sz="1"/>
-              <w:left w:val="single" w:color="D6DEEA" w:sz="1"/>
-              <w:bottom w:val="single" w:color="D6DEEA" w:sz="1"/>
-              <w:right w:val="single" w:color="D6DEEA" w:sz="1"/>
-            </w:tcBorders>
-            <w:shd w:fill="FFFFFF" w:val="clear"/>
-            <w:tcMar>
-              <w:top w:type="dxa" w:w="46"/>
-              <w:left w:type="dxa" w:w="94"/>
-              <w:bottom w:type="dxa" w:w="46"/>
-              <w:right w:type="dxa" w:w="94"/>
-            </w:tcMar>
-          </w:tcPr>
-          <w:p>
-            <w:pPr>
-              <w:jc w:val="left"/>
-            </w:pPr>
-            <w:r>
-              <w:rPr>
-                <w:b w:val="false"/>
-                <w:bCs w:val="false"/>
-                <w:color w:val="14274A"/>
-                <w:sz w:val="17"/>
-                <w:szCs w:val="17"/>
-              </w:rPr>
-              <w:t xml:space="preserve">approval</w:t>
-            </w:r>
-          </w:p>
-        </w:tc>
-        <w:tc>
-          <w:tcPr>
-            <w:tcW w:type="dxa" w:w="1500"/>
-            <w:tcBorders>
-              <w:top w:val="single" w:color="D6DEEA" w:sz="1"/>
-              <w:left w:val="single" w:color="D6DEEA" w:sz="1"/>
-              <w:bottom w:val="single" w:color="D6DEEA" w:sz="1"/>
-              <w:right w:val="single" w:color="D6DEEA" w:sz="1"/>
-            </w:tcBorders>
-            <w:shd w:fill="FFFFFF" w:val="clear"/>
-            <w:tcMar>
-              <w:top w:type="dxa" w:w="46"/>
-              <w:left w:type="dxa" w:w="94"/>
-              <w:bottom w:type="dxa" w:w="46"/>
-              <w:right w:type="dxa" w:w="94"/>
-            </w:tcMar>
-          </w:tcPr>
-          <w:p>
-            <w:pPr>
-              <w:jc w:val="left"/>
-            </w:pPr>
-            <w:r>
-              <w:rPr>
-                <w:b w:val="false"/>
-                <w:bCs w:val="false"/>
-                <w:color w:val="14274A"/>
-                <w:sz w:val="17"/>
-                <w:szCs w:val="17"/>
-              </w:rPr>
-              <w:t xml:space="preserve">68%</w:t>
-            </w:r>
-          </w:p>
-        </w:tc>
-        <w:tc>
-          <w:tcPr>
-            <w:tcW w:type="dxa" w:w="1760"/>
-            <w:tcBorders>
-              <w:top w:val="single" w:color="D6DEEA" w:sz="1"/>
-              <w:left w:val="single" w:color="D6DEEA" w:sz="1"/>
-              <w:bottom w:val="single" w:color="D6DEEA" w:sz="1"/>
-              <w:right w:val="single" w:color="D6DEEA" w:sz="1"/>
-            </w:tcBorders>
-            <w:shd w:fill="FFFFFF" w:val="clear"/>
-            <w:tcMar>
-              <w:top w:type="dxa" w:w="46"/>
-              <w:left w:type="dxa" w:w="94"/>
-              <w:bottom w:type="dxa" w:w="46"/>
-              <w:right w:type="dxa" w:w="94"/>
-            </w:tcMar>
-          </w:tcPr>
-          <w:p>
-            <w:pPr>
-              <w:jc w:val="left"/>
-            </w:pPr>
-            <w:r>
-              <w:rPr>
-                <w:b w:val="false"/>
-                <w:bCs w:val="false"/>
-                <w:color w:val="14274A"/>
-                <w:sz w:val="17"/>
-                <w:szCs w:val="17"/>
-              </w:rPr>
-              <w:t xml:space="preserve">Q4 2026 – Q1 2027</w:t>
+            <w:tcW w:type="dxa" w:w="2550"/>
+            <w:tcBorders>
+              <w:top w:val="single" w:color="D6DEEA" w:sz="1"/>
+              <w:left w:val="single" w:color="D6DEEA" w:sz="1"/>
+              <w:bottom w:val="single" w:color="D6DEEA" w:sz="1"/>
+              <w:right w:val="single" w:color="D6DEEA" w:sz="1"/>
+            </w:tcBorders>
+            <w:shd w:fill="FFFFFF" w:val="clear"/>
+            <w:tcMar>
+              <w:top w:type="dxa" w:w="46"/>
+              <w:left w:type="dxa" w:w="94"/>
+              <w:bottom w:type="dxa" w:w="46"/>
+              <w:right w:type="dxa" w:w="94"/>
+            </w:tcMar>
+          </w:tcPr>
+          <w:p>
+            <w:pPr>
+              <w:jc w:val="left"/>
+            </w:pPr>
+            <w:r>
+              <w:rPr>
+                <w:b/>
+                <w:bCs/>
+              </w:rPr>
+              <w:t xml:space="preserve">FcRn biology imposes a dosing floor</w:t>
+            </w:r>
+          </w:p>
+        </w:tc>
+        <w:tc>
+          <w:tcPr>
+            <w:tcW w:type="dxa" w:w="6810"/>
+            <w:tcBorders>
+              <w:top w:val="single" w:color="D6DEEA" w:sz="1"/>
+              <w:left w:val="single" w:color="D6DEEA" w:sz="1"/>
+              <w:bottom w:val="single" w:color="D6DEEA" w:sz="1"/>
+              <w:right w:val="single" w:color="D6DEEA" w:sz="1"/>
+            </w:tcBorders>
+            <w:shd w:fill="FFFFFF" w:val="clear"/>
+            <w:tcMar>
+              <w:top w:type="dxa" w:w="46"/>
+              <w:left w:type="dxa" w:w="94"/>
+              <w:bottom w:type="dxa" w:w="46"/>
+              <w:right w:type="dxa" w:w="94"/>
+            </w:tcMar>
+          </w:tcPr>
+          <w:p>
+            <w:pPr>
+              <w:jc w:val="left"/>
+            </w:pPr>
+            <w:r>
+              <w:rPr>
+                <w:b w:val="false"/>
+                <w:bCs w:val="false"/>
+                <w:color w:val="14274A"/>
+                <w:sz w:val="17"/>
+                <w:szCs w:val="17"/>
+              </w:rPr>
+              <w:t xml:space="preserve">the core risk: if clinical efficacy requires periodic deep IgG troughs, half-life extension alone may not meaningfully reduce dosing frequency — long exposure ≠ sustained-deep-enough suppression.</w:t>
             </w:r>
           </w:p>
         </w:tc>
@@ -8006,7 +7964,7 @@
         </w:trPr>
         <w:tc>
           <w:tcPr>
-            <w:tcW w:type="dxa" w:w="4600"/>
+            <w:tcW w:type="dxa" w:w="2550"/>
             <w:tcBorders>
               <w:top w:val="single" w:color="D6DEEA" w:sz="1"/>
               <w:left w:val="single" w:color="D6DEEA" w:sz="1"/>
@@ -8027,19 +7985,16 @@
             </w:pPr>
             <w:r>
               <w:rPr>
-                <w:b w:val="false"/>
-                <w:bCs w:val="false"/>
-                <w:color w:val="14274A"/>
-                <w:sz w:val="17"/>
-                <w:szCs w:val="17"/>
-              </w:rPr>
-              <w:t xml:space="preserve">IMVT-1402 reports a positive pivotal readout (any indication)</w:t>
-            </w:r>
-          </w:p>
-        </w:tc>
-        <w:tc>
-          <w:tcPr>
-            <w:tcW w:type="dxa" w:w="1500"/>
+                <w:b/>
+                <w:bCs/>
+              </w:rPr>
+              <w:t xml:space="preserve">PK gains don't translate to PD/clinical benefit</w:t>
+            </w:r>
+          </w:p>
+        </w:tc>
+        <w:tc>
+          <w:tcPr>
+            <w:tcW w:type="dxa" w:w="6810"/>
             <w:tcBorders>
               <w:top w:val="single" w:color="D6DEEA" w:sz="1"/>
               <w:left w:val="single" w:color="D6DEEA" w:sz="1"/>
@@ -8066,73 +8021,7 @@
                 <w:sz w:val="17"/>
                 <w:szCs w:val="17"/>
               </w:rPr>
-              <w:t xml:space="preserve">outcome</w:t>
-            </w:r>
-          </w:p>
-        </w:tc>
-        <w:tc>
-          <w:tcPr>
-            <w:tcW w:type="dxa" w:w="1500"/>
-            <w:tcBorders>
-              <w:top w:val="single" w:color="D6DEEA" w:sz="1"/>
-              <w:left w:val="single" w:color="D6DEEA" w:sz="1"/>
-              <w:bottom w:val="single" w:color="D6DEEA" w:sz="1"/>
-              <w:right w:val="single" w:color="D6DEEA" w:sz="1"/>
-            </w:tcBorders>
-            <w:shd w:fill="F5F8FF" w:val="clear"/>
-            <w:tcMar>
-              <w:top w:type="dxa" w:w="46"/>
-              <w:left w:type="dxa" w:w="94"/>
-              <w:bottom w:type="dxa" w:w="46"/>
-              <w:right w:type="dxa" w:w="94"/>
-            </w:tcMar>
-          </w:tcPr>
-          <w:p>
-            <w:pPr>
-              <w:jc w:val="left"/>
-            </w:pPr>
-            <w:r>
-              <w:rPr>
-                <w:b w:val="false"/>
-                <w:bCs w:val="false"/>
-                <w:color w:val="14274A"/>
-                <w:sz w:val="17"/>
-                <w:szCs w:val="17"/>
-              </w:rPr>
-              <w:t xml:space="preserve">50%</w:t>
-            </w:r>
-          </w:p>
-        </w:tc>
-        <w:tc>
-          <w:tcPr>
-            <w:tcW w:type="dxa" w:w="1760"/>
-            <w:tcBorders>
-              <w:top w:val="single" w:color="D6DEEA" w:sz="1"/>
-              <w:left w:val="single" w:color="D6DEEA" w:sz="1"/>
-              <w:bottom w:val="single" w:color="D6DEEA" w:sz="1"/>
-              <w:right w:val="single" w:color="D6DEEA" w:sz="1"/>
-            </w:tcBorders>
-            <w:shd w:fill="F5F8FF" w:val="clear"/>
-            <w:tcMar>
-              <w:top w:type="dxa" w:w="46"/>
-              <w:left w:type="dxa" w:w="94"/>
-              <w:bottom w:type="dxa" w:w="46"/>
-              <w:right w:type="dxa" w:w="94"/>
-            </w:tcMar>
-          </w:tcPr>
-          <w:p>
-            <w:pPr>
-              <w:jc w:val="left"/>
-            </w:pPr>
-            <w:r>
-              <w:rPr>
-                <w:b w:val="false"/>
-                <w:bCs w:val="false"/>
-                <w:color w:val="14274A"/>
-                <w:sz w:val="17"/>
-                <w:szCs w:val="17"/>
-              </w:rPr>
-              <w:t xml:space="preserve">2027</w:t>
+              <w:t xml:space="preserve">a longer-circulating drug may keep IgG only modestly suppressed between doses, losing the disease control that frequent deep cycles provide.</w:t>
             </w:r>
           </w:p>
         </w:tc>
@@ -8143,133 +8032,64 @@
         </w:trPr>
         <w:tc>
           <w:tcPr>
-            <w:tcW w:type="dxa" w:w="4600"/>
-            <w:tcBorders>
-              <w:top w:val="single" w:color="D6DEEA" w:sz="1"/>
-              <w:left w:val="single" w:color="D6DEEA" w:sz="1"/>
-              <w:bottom w:val="single" w:color="D6DEEA" w:sz="1"/>
-              <w:right w:val="single" w:color="D6DEEA" w:sz="1"/>
-            </w:tcBorders>
-            <w:shd w:fill="FFFFFF" w:val="clear"/>
-            <w:tcMar>
-              <w:top w:type="dxa" w:w="46"/>
-              <w:left w:type="dxa" w:w="94"/>
-              <w:bottom w:type="dxa" w:w="46"/>
-              <w:right w:type="dxa" w:w="94"/>
-            </w:tcMar>
-          </w:tcPr>
-          <w:p>
-            <w:pPr>
-              <w:jc w:val="left"/>
-            </w:pPr>
-            <w:r>
-              <w:rPr>
-                <w:b w:val="false"/>
-                <w:bCs w:val="false"/>
-                <w:color w:val="14274A"/>
-                <w:sz w:val="17"/>
-                <w:szCs w:val="17"/>
-              </w:rPr>
-              <w:t xml:space="preserve">A first extended-half-life FcRn inhibitor reaches the clinic</w:t>
-            </w:r>
-          </w:p>
-        </w:tc>
-        <w:tc>
-          <w:tcPr>
-            <w:tcW w:type="dxa" w:w="1500"/>
-            <w:tcBorders>
-              <w:top w:val="single" w:color="D6DEEA" w:sz="1"/>
-              <w:left w:val="single" w:color="D6DEEA" w:sz="1"/>
-              <w:bottom w:val="single" w:color="D6DEEA" w:sz="1"/>
-              <w:right w:val="single" w:color="D6DEEA" w:sz="1"/>
-            </w:tcBorders>
-            <w:shd w:fill="FFFFFF" w:val="clear"/>
-            <w:tcMar>
-              <w:top w:type="dxa" w:w="46"/>
-              <w:left w:type="dxa" w:w="94"/>
-              <w:bottom w:type="dxa" w:w="46"/>
-              <w:right w:type="dxa" w:w="94"/>
-            </w:tcMar>
-          </w:tcPr>
-          <w:p>
-            <w:pPr>
-              <w:jc w:val="left"/>
-            </w:pPr>
-            <w:r>
-              <w:rPr>
-                <w:b w:val="false"/>
-                <w:bCs w:val="false"/>
-                <w:color w:val="14274A"/>
-                <w:sz w:val="17"/>
-                <w:szCs w:val="17"/>
-              </w:rPr>
-              <w:t xml:space="preserve">first-to-clinic</w:t>
-            </w:r>
-          </w:p>
-        </w:tc>
-        <w:tc>
-          <w:tcPr>
-            <w:tcW w:type="dxa" w:w="1500"/>
-            <w:tcBorders>
-              <w:top w:val="single" w:color="D6DEEA" w:sz="1"/>
-              <w:left w:val="single" w:color="D6DEEA" w:sz="1"/>
-              <w:bottom w:val="single" w:color="D6DEEA" w:sz="1"/>
-              <w:right w:val="single" w:color="D6DEEA" w:sz="1"/>
-            </w:tcBorders>
-            <w:shd w:fill="FFFFFF" w:val="clear"/>
-            <w:tcMar>
-              <w:top w:type="dxa" w:w="46"/>
-              <w:left w:type="dxa" w:w="94"/>
-              <w:bottom w:type="dxa" w:w="46"/>
-              <w:right w:type="dxa" w:w="94"/>
-            </w:tcMar>
-          </w:tcPr>
-          <w:p>
-            <w:pPr>
-              <w:jc w:val="left"/>
-            </w:pPr>
-            <w:r>
-              <w:rPr>
-                <w:b w:val="false"/>
-                <w:bCs w:val="false"/>
-                <w:color w:val="14274A"/>
-                <w:sz w:val="17"/>
-                <w:szCs w:val="17"/>
-              </w:rPr>
-              <w:t xml:space="preserve">45-55%</w:t>
-            </w:r>
-          </w:p>
-        </w:tc>
-        <w:tc>
-          <w:tcPr>
-            <w:tcW w:type="dxa" w:w="1760"/>
-            <w:tcBorders>
-              <w:top w:val="single" w:color="D6DEEA" w:sz="1"/>
-              <w:left w:val="single" w:color="D6DEEA" w:sz="1"/>
-              <w:bottom w:val="single" w:color="D6DEEA" w:sz="1"/>
-              <w:right w:val="single" w:color="D6DEEA" w:sz="1"/>
-            </w:tcBorders>
-            <w:shd w:fill="FFFFFF" w:val="clear"/>
-            <w:tcMar>
-              <w:top w:type="dxa" w:w="46"/>
-              <w:left w:type="dxa" w:w="94"/>
-              <w:bottom w:type="dxa" w:w="46"/>
-              <w:right w:type="dxa" w:w="94"/>
-            </w:tcMar>
-          </w:tcPr>
-          <w:p>
-            <w:pPr>
-              <w:jc w:val="left"/>
-            </w:pPr>
-            <w:r>
-              <w:rPr>
-                <w:b w:val="false"/>
-                <w:bCs w:val="false"/>
-                <w:color w:val="14274A"/>
-                <w:sz w:val="17"/>
-                <w:szCs w:val="17"/>
-              </w:rPr>
-              <w:t xml:space="preserve">2026 – 2027</w:t>
+            <w:tcW w:type="dxa" w:w="2550"/>
+            <w:tcBorders>
+              <w:top w:val="single" w:color="D6DEEA" w:sz="1"/>
+              <w:left w:val="single" w:color="D6DEEA" w:sz="1"/>
+              <w:bottom w:val="single" w:color="D6DEEA" w:sz="1"/>
+              <w:right w:val="single" w:color="D6DEEA" w:sz="1"/>
+            </w:tcBorders>
+            <w:shd w:fill="FFFFFF" w:val="clear"/>
+            <w:tcMar>
+              <w:top w:type="dxa" w:w="46"/>
+              <w:left w:type="dxa" w:w="94"/>
+              <w:bottom w:type="dxa" w:w="46"/>
+              <w:right w:type="dxa" w:w="94"/>
+            </w:tcMar>
+          </w:tcPr>
+          <w:p>
+            <w:pPr>
+              <w:jc w:val="left"/>
+            </w:pPr>
+            <w:r>
+              <w:rPr>
+                <w:b/>
+                <w:bCs/>
+              </w:rPr>
+              <w:t xml:space="preserve">Longer exposure worsens safety</w:t>
+            </w:r>
+          </w:p>
+        </w:tc>
+        <w:tc>
+          <w:tcPr>
+            <w:tcW w:type="dxa" w:w="6810"/>
+            <w:tcBorders>
+              <w:top w:val="single" w:color="D6DEEA" w:sz="1"/>
+              <w:left w:val="single" w:color="D6DEEA" w:sz="1"/>
+              <w:bottom w:val="single" w:color="D6DEEA" w:sz="1"/>
+              <w:right w:val="single" w:color="D6DEEA" w:sz="1"/>
+            </w:tcBorders>
+            <w:shd w:fill="FFFFFF" w:val="clear"/>
+            <w:tcMar>
+              <w:top w:type="dxa" w:w="46"/>
+              <w:left w:type="dxa" w:w="94"/>
+              <w:bottom w:type="dxa" w:w="46"/>
+              <w:right w:type="dxa" w:w="94"/>
+            </w:tcMar>
+          </w:tcPr>
+          <w:p>
+            <w:pPr>
+              <w:jc w:val="left"/>
+            </w:pPr>
+            <w:r>
+              <w:rPr>
+                <w:b w:val="false"/>
+                <w:bCs w:val="false"/>
+                <w:color w:val="14274A"/>
+                <w:sz w:val="17"/>
+                <w:szCs w:val="17"/>
+              </w:rPr>
+              <w:t xml:space="preserve">sustained deep IgG lowering raises infection risk, and continuous FcRn engagement can affect albumin/lipids — the safety envelope may cap how much exposure (and how infrequent a dose) is acceptable.</w:t>
             </w:r>
           </w:p>
         </w:tc>
@@ -8280,7 +8100,7 @@
         </w:trPr>
         <w:tc>
           <w:tcPr>
-            <w:tcW w:type="dxa" w:w="4600"/>
+            <w:tcW w:type="dxa" w:w="2550"/>
             <w:tcBorders>
               <w:top w:val="single" w:color="D6DEEA" w:sz="1"/>
               <w:left w:val="single" w:color="D6DEEA" w:sz="1"/>
@@ -8301,6 +8121,862 @@
             </w:pPr>
             <w:r>
               <w:rPr>
+                <w:b/>
+                <w:bCs/>
+              </w:rPr>
+              <w:t xml:space="preserve">IMVT-1402 / incumbents close the gap</w:t>
+            </w:r>
+          </w:p>
+        </w:tc>
+        <w:tc>
+          <w:tcPr>
+            <w:tcW w:type="dxa" w:w="6810"/>
+            <w:tcBorders>
+              <w:top w:val="single" w:color="D6DEEA" w:sz="1"/>
+              <w:left w:val="single" w:color="D6DEEA" w:sz="1"/>
+              <w:bottom w:val="single" w:color="D6DEEA" w:sz="1"/>
+              <w:right w:val="single" w:color="D6DEEA" w:sz="1"/>
+            </w:tcBorders>
+            <w:shd w:fill="F5F8FF" w:val="clear"/>
+            <w:tcMar>
+              <w:top w:type="dxa" w:w="46"/>
+              <w:left w:type="dxa" w:w="94"/>
+              <w:bottom w:type="dxa" w:w="46"/>
+              <w:right w:type="dxa" w:w="94"/>
+            </w:tcMar>
+          </w:tcPr>
+          <w:p>
+            <w:pPr>
+              <w:jc w:val="left"/>
+            </w:pPr>
+            <w:r>
+              <w:rPr>
+                <w:b w:val="false"/>
+                <w:bCs w:val="false"/>
+                <w:color w:val="14274A"/>
+                <w:sz w:val="17"/>
+                <w:szCs w:val="17"/>
+              </w:rPr>
+              <w:t xml:space="preserve">IMVT-1402 is already chasing convenience and breadth; the approved franchises can extend dosing intervals themselves, eroding a newcomer's only differentiation.</w:t>
+            </w:r>
+          </w:p>
+        </w:tc>
+      </w:tr>
+      <w:tr>
+        <w:trPr>
+          <w:tblHeader w:val="false"/>
+        </w:trPr>
+        <w:tc>
+          <w:tcPr>
+            <w:tcW w:type="dxa" w:w="2550"/>
+            <w:tcBorders>
+              <w:top w:val="single" w:color="D6DEEA" w:sz="1"/>
+              <w:left w:val="single" w:color="D6DEEA" w:sz="1"/>
+              <w:bottom w:val="single" w:color="D6DEEA" w:sz="1"/>
+              <w:right w:val="single" w:color="D6DEEA" w:sz="1"/>
+            </w:tcBorders>
+            <w:shd w:fill="FFFFFF" w:val="clear"/>
+            <w:tcMar>
+              <w:top w:type="dxa" w:w="46"/>
+              <w:left w:type="dxa" w:w="94"/>
+              <w:bottom w:type="dxa" w:w="46"/>
+              <w:right w:type="dxa" w:w="94"/>
+            </w:tcMar>
+          </w:tcPr>
+          <w:p>
+            <w:pPr>
+              <w:jc w:val="left"/>
+            </w:pPr>
+            <w:r>
+              <w:rPr>
+                <w:b/>
+                <w:bCs/>
+              </w:rPr>
+              <w:t xml:space="preserve">Cell therapy disrupts chronic dosing</w:t>
+            </w:r>
+          </w:p>
+        </w:tc>
+        <w:tc>
+          <w:tcPr>
+            <w:tcW w:type="dxa" w:w="6810"/>
+            <w:tcBorders>
+              <w:top w:val="single" w:color="D6DEEA" w:sz="1"/>
+              <w:left w:val="single" w:color="D6DEEA" w:sz="1"/>
+              <w:bottom w:val="single" w:color="D6DEEA" w:sz="1"/>
+              <w:right w:val="single" w:color="D6DEEA" w:sz="1"/>
+            </w:tcBorders>
+            <w:shd w:fill="FFFFFF" w:val="clear"/>
+            <w:tcMar>
+              <w:top w:type="dxa" w:w="46"/>
+              <w:left w:type="dxa" w:w="94"/>
+              <w:bottom w:type="dxa" w:w="46"/>
+              <w:right w:type="dxa" w:w="94"/>
+            </w:tcMar>
+          </w:tcPr>
+          <w:p>
+            <w:pPr>
+              <w:jc w:val="left"/>
+            </w:pPr>
+            <w:r>
+              <w:rPr>
+                <w:b w:val="false"/>
+                <w:bCs w:val="false"/>
+                <w:color w:val="14274A"/>
+                <w:sz w:val="17"/>
+                <w:szCs w:val="17"/>
+              </w:rPr>
+              <w:t xml:space="preserve">if one-time B-cell / CAR-T therapy delivers durable drug-free remission, the entire chronic-FcRn-dosing model — convenient or not — is threatened.</w:t>
+            </w:r>
+          </w:p>
+        </w:tc>
+      </w:tr>
+    </w:tbl>
+    <w:p>
+      <w:pPr>
+        <w:pStyle w:val="Heading1"/>
+      </w:pPr>
+      <w:r>
+        <w:t xml:space="preserve">13 · Standing predictions</w:t>
+      </w:r>
+    </w:p>
+    <w:p>
+      <w:pPr>
+        <w:spacing w:after="120"/>
+      </w:pPr>
+      <w:r>
+        <w:rPr>
+          <w:i/>
+          <w:iCs/>
+        </w:rPr>
+        <w:t xml:space="preserve">Confidence is a 1-5 calibration of how firmly the evidence supports the call (5 = strong data + precedent; 2 = mechanistic hypothesis).</w:t>
+      </w:r>
+    </w:p>
+    <w:tbl>
+      <w:tblPr>
+        <w:tblW w:type="dxa" w:w="9360"/>
+        <w:tblBorders>
+          <w:top w:val="single" w:color="auto" w:sz="4"/>
+          <w:left w:val="single" w:color="auto" w:sz="4"/>
+          <w:bottom w:val="single" w:color="auto" w:sz="4"/>
+          <w:right w:val="single" w:color="auto" w:sz="4"/>
+          <w:insideH w:val="single" w:color="auto" w:sz="4"/>
+          <w:insideV w:val="single" w:color="auto" w:sz="4"/>
+        </w:tblBorders>
+      </w:tblPr>
+      <w:tblGrid>
+        <w:gridCol w:w="3250"/>
+        <w:gridCol w:w="1150"/>
+        <w:gridCol w:w="1250"/>
+        <w:gridCol w:w="1550"/>
+        <w:gridCol w:w="2160"/>
+      </w:tblGrid>
+      <w:tr>
+        <w:trPr>
+          <w:tblHeader/>
+        </w:trPr>
+        <w:tc>
+          <w:tcPr>
+            <w:tcW w:type="dxa" w:w="3250"/>
+            <w:tcBorders>
+              <w:top w:val="single" w:color="1A3F8F" w:sz="1"/>
+              <w:left w:val="single" w:color="1A3F8F" w:sz="1"/>
+              <w:bottom w:val="single" w:color="1A3F8F" w:sz="1"/>
+              <w:right w:val="single" w:color="1A3F8F" w:sz="1"/>
+            </w:tcBorders>
+            <w:shd w:fill="1A3F8F" w:val="clear"/>
+            <w:tcMar>
+              <w:top w:type="dxa" w:w="46"/>
+              <w:left w:type="dxa" w:w="94"/>
+              <w:bottom w:type="dxa" w:w="46"/>
+              <w:right w:type="dxa" w:w="94"/>
+            </w:tcMar>
+          </w:tcPr>
+          <w:p>
+            <w:pPr>
+              <w:jc w:val="left"/>
+            </w:pPr>
+            <w:r>
+              <w:rPr>
+                <w:b/>
+                <w:bCs/>
+                <w:color w:val="FFFFFF"/>
+                <w:sz w:val="17"/>
+                <w:szCs w:val="17"/>
+              </w:rPr>
+              <w:t xml:space="preserve">Prediction</w:t>
+            </w:r>
+          </w:p>
+        </w:tc>
+        <w:tc>
+          <w:tcPr>
+            <w:tcW w:type="dxa" w:w="1150"/>
+            <w:tcBorders>
+              <w:top w:val="single" w:color="1A3F8F" w:sz="1"/>
+              <w:left w:val="single" w:color="1A3F8F" w:sz="1"/>
+              <w:bottom w:val="single" w:color="1A3F8F" w:sz="1"/>
+              <w:right w:val="single" w:color="1A3F8F" w:sz="1"/>
+            </w:tcBorders>
+            <w:shd w:fill="1A3F8F" w:val="clear"/>
+            <w:tcMar>
+              <w:top w:type="dxa" w:w="46"/>
+              <w:left w:type="dxa" w:w="94"/>
+              <w:bottom w:type="dxa" w:w="46"/>
+              <w:right w:type="dxa" w:w="94"/>
+            </w:tcMar>
+          </w:tcPr>
+          <w:p>
+            <w:pPr>
+              <w:jc w:val="left"/>
+            </w:pPr>
+            <w:r>
+              <w:rPr>
+                <w:b/>
+                <w:bCs/>
+                <w:color w:val="FFFFFF"/>
+                <w:sz w:val="17"/>
+                <w:szCs w:val="17"/>
+              </w:rPr>
+              <w:t xml:space="preserve">Type</w:t>
+            </w:r>
+          </w:p>
+        </w:tc>
+        <w:tc>
+          <w:tcPr>
+            <w:tcW w:type="dxa" w:w="1250"/>
+            <w:tcBorders>
+              <w:top w:val="single" w:color="1A3F8F" w:sz="1"/>
+              <w:left w:val="single" w:color="1A3F8F" w:sz="1"/>
+              <w:bottom w:val="single" w:color="1A3F8F" w:sz="1"/>
+              <w:right w:val="single" w:color="1A3F8F" w:sz="1"/>
+            </w:tcBorders>
+            <w:shd w:fill="1A3F8F" w:val="clear"/>
+            <w:tcMar>
+              <w:top w:type="dxa" w:w="46"/>
+              <w:left w:type="dxa" w:w="94"/>
+              <w:bottom w:type="dxa" w:w="46"/>
+              <w:right w:type="dxa" w:w="94"/>
+            </w:tcMar>
+          </w:tcPr>
+          <w:p>
+            <w:pPr>
+              <w:jc w:val="left"/>
+            </w:pPr>
+            <w:r>
+              <w:rPr>
+                <w:b/>
+                <w:bCs/>
+                <w:color w:val="FFFFFF"/>
+                <w:sz w:val="17"/>
+                <w:szCs w:val="17"/>
+              </w:rPr>
+              <w:t xml:space="preserve">Estimate</w:t>
+            </w:r>
+          </w:p>
+        </w:tc>
+        <w:tc>
+          <w:tcPr>
+            <w:tcW w:type="dxa" w:w="1550"/>
+            <w:tcBorders>
+              <w:top w:val="single" w:color="1A3F8F" w:sz="1"/>
+              <w:left w:val="single" w:color="1A3F8F" w:sz="1"/>
+              <w:bottom w:val="single" w:color="1A3F8F" w:sz="1"/>
+              <w:right w:val="single" w:color="1A3F8F" w:sz="1"/>
+            </w:tcBorders>
+            <w:shd w:fill="1A3F8F" w:val="clear"/>
+            <w:tcMar>
+              <w:top w:type="dxa" w:w="46"/>
+              <w:left w:type="dxa" w:w="94"/>
+              <w:bottom w:type="dxa" w:w="46"/>
+              <w:right w:type="dxa" w:w="94"/>
+            </w:tcMar>
+          </w:tcPr>
+          <w:p>
+            <w:pPr>
+              <w:jc w:val="left"/>
+            </w:pPr>
+            <w:r>
+              <w:rPr>
+                <w:b/>
+                <w:bCs/>
+                <w:color w:val="FFFFFF"/>
+                <w:sz w:val="17"/>
+                <w:szCs w:val="17"/>
+              </w:rPr>
+              <w:t xml:space="preserve">Resolves (range)</w:t>
+            </w:r>
+          </w:p>
+        </w:tc>
+        <w:tc>
+          <w:tcPr>
+            <w:tcW w:type="dxa" w:w="2160"/>
+            <w:tcBorders>
+              <w:top w:val="single" w:color="1A3F8F" w:sz="1"/>
+              <w:left w:val="single" w:color="1A3F8F" w:sz="1"/>
+              <w:bottom w:val="single" w:color="1A3F8F" w:sz="1"/>
+              <w:right w:val="single" w:color="1A3F8F" w:sz="1"/>
+            </w:tcBorders>
+            <w:shd w:fill="1A3F8F" w:val="clear"/>
+            <w:tcMar>
+              <w:top w:type="dxa" w:w="46"/>
+              <w:left w:type="dxa" w:w="94"/>
+              <w:bottom w:type="dxa" w:w="46"/>
+              <w:right w:type="dxa" w:w="94"/>
+            </w:tcMar>
+          </w:tcPr>
+          <w:p>
+            <w:pPr>
+              <w:jc w:val="left"/>
+            </w:pPr>
+            <w:r>
+              <w:rPr>
+                <w:b/>
+                <w:bCs/>
+                <w:color w:val="FFFFFF"/>
+                <w:sz w:val="17"/>
+                <w:szCs w:val="17"/>
+              </w:rPr>
+              <w:t xml:space="preserve">Confidence · basis</w:t>
+            </w:r>
+          </w:p>
+        </w:tc>
+      </w:tr>
+      <w:tr>
+        <w:trPr>
+          <w:tblHeader w:val="false"/>
+        </w:trPr>
+        <w:tc>
+          <w:tcPr>
+            <w:tcW w:type="dxa" w:w="3250"/>
+            <w:tcBorders>
+              <w:top w:val="single" w:color="D6DEEA" w:sz="1"/>
+              <w:left w:val="single" w:color="D6DEEA" w:sz="1"/>
+              <w:bottom w:val="single" w:color="D6DEEA" w:sz="1"/>
+              <w:right w:val="single" w:color="D6DEEA" w:sz="1"/>
+            </w:tcBorders>
+            <w:shd w:fill="FFFFFF" w:val="clear"/>
+            <w:tcMar>
+              <w:top w:type="dxa" w:w="46"/>
+              <w:left w:type="dxa" w:w="94"/>
+              <w:bottom w:type="dxa" w:w="46"/>
+              <w:right w:type="dxa" w:w="94"/>
+            </w:tcMar>
+          </w:tcPr>
+          <w:p>
+            <w:pPr>
+              <w:jc w:val="left"/>
+            </w:pPr>
+            <w:r>
+              <w:rPr>
+                <w:b w:val="false"/>
+                <w:bCs w:val="false"/>
+                <w:color w:val="14274A"/>
+                <w:sz w:val="17"/>
+                <w:szCs w:val="17"/>
+              </w:rPr>
+              <w:t xml:space="preserve">Nipocalimab is approved in wAIHA</w:t>
+            </w:r>
+          </w:p>
+        </w:tc>
+        <w:tc>
+          <w:tcPr>
+            <w:tcW w:type="dxa" w:w="1150"/>
+            <w:tcBorders>
+              <w:top w:val="single" w:color="D6DEEA" w:sz="1"/>
+              <w:left w:val="single" w:color="D6DEEA" w:sz="1"/>
+              <w:bottom w:val="single" w:color="D6DEEA" w:sz="1"/>
+              <w:right w:val="single" w:color="D6DEEA" w:sz="1"/>
+            </w:tcBorders>
+            <w:shd w:fill="FFFFFF" w:val="clear"/>
+            <w:tcMar>
+              <w:top w:type="dxa" w:w="46"/>
+              <w:left w:type="dxa" w:w="94"/>
+              <w:bottom w:type="dxa" w:w="46"/>
+              <w:right w:type="dxa" w:w="94"/>
+            </w:tcMar>
+          </w:tcPr>
+          <w:p>
+            <w:pPr>
+              <w:jc w:val="left"/>
+            </w:pPr>
+            <w:r>
+              <w:rPr>
+                <w:b w:val="false"/>
+                <w:bCs w:val="false"/>
+                <w:color w:val="14274A"/>
+                <w:sz w:val="17"/>
+                <w:szCs w:val="17"/>
+              </w:rPr>
+              <w:t xml:space="preserve">approval</w:t>
+            </w:r>
+          </w:p>
+        </w:tc>
+        <w:tc>
+          <w:tcPr>
+            <w:tcW w:type="dxa" w:w="1250"/>
+            <w:tcBorders>
+              <w:top w:val="single" w:color="D6DEEA" w:sz="1"/>
+              <w:left w:val="single" w:color="D6DEEA" w:sz="1"/>
+              <w:bottom w:val="single" w:color="D6DEEA" w:sz="1"/>
+              <w:right w:val="single" w:color="D6DEEA" w:sz="1"/>
+            </w:tcBorders>
+            <w:shd w:fill="FFFFFF" w:val="clear"/>
+            <w:tcMar>
+              <w:top w:type="dxa" w:w="46"/>
+              <w:left w:type="dxa" w:w="94"/>
+              <w:bottom w:type="dxa" w:w="46"/>
+              <w:right w:type="dxa" w:w="94"/>
+            </w:tcMar>
+          </w:tcPr>
+          <w:p>
+            <w:pPr>
+              <w:jc w:val="left"/>
+            </w:pPr>
+            <w:r>
+              <w:rPr>
+                <w:b w:val="false"/>
+                <w:bCs w:val="false"/>
+                <w:color w:val="14274A"/>
+                <w:sz w:val="17"/>
+                <w:szCs w:val="17"/>
+              </w:rPr>
+              <w:t xml:space="preserve">68%</w:t>
+            </w:r>
+          </w:p>
+        </w:tc>
+        <w:tc>
+          <w:tcPr>
+            <w:tcW w:type="dxa" w:w="1550"/>
+            <w:tcBorders>
+              <w:top w:val="single" w:color="D6DEEA" w:sz="1"/>
+              <w:left w:val="single" w:color="D6DEEA" w:sz="1"/>
+              <w:bottom w:val="single" w:color="D6DEEA" w:sz="1"/>
+              <w:right w:val="single" w:color="D6DEEA" w:sz="1"/>
+            </w:tcBorders>
+            <w:shd w:fill="FFFFFF" w:val="clear"/>
+            <w:tcMar>
+              <w:top w:type="dxa" w:w="46"/>
+              <w:left w:type="dxa" w:w="94"/>
+              <w:bottom w:type="dxa" w:w="46"/>
+              <w:right w:type="dxa" w:w="94"/>
+            </w:tcMar>
+          </w:tcPr>
+          <w:p>
+            <w:pPr>
+              <w:jc w:val="left"/>
+            </w:pPr>
+            <w:r>
+              <w:rPr>
+                <w:b w:val="false"/>
+                <w:bCs w:val="false"/>
+                <w:color w:val="14274A"/>
+                <w:sz w:val="17"/>
+                <w:szCs w:val="17"/>
+              </w:rPr>
+              <w:t xml:space="preserve">Q4 2026 – Q1 2027</w:t>
+            </w:r>
+          </w:p>
+        </w:tc>
+        <w:tc>
+          <w:tcPr>
+            <w:tcW w:type="dxa" w:w="2160"/>
+            <w:tcBorders>
+              <w:top w:val="single" w:color="D6DEEA" w:sz="1"/>
+              <w:left w:val="single" w:color="D6DEEA" w:sz="1"/>
+              <w:bottom w:val="single" w:color="D6DEEA" w:sz="1"/>
+              <w:right w:val="single" w:color="D6DEEA" w:sz="1"/>
+            </w:tcBorders>
+            <w:shd w:fill="FFFFFF" w:val="clear"/>
+            <w:tcMar>
+              <w:top w:type="dxa" w:w="46"/>
+              <w:left w:type="dxa" w:w="94"/>
+              <w:bottom w:type="dxa" w:w="46"/>
+              <w:right w:type="dxa" w:w="94"/>
+            </w:tcMar>
+          </w:tcPr>
+          <w:p>
+            <w:pPr>
+              <w:jc w:val="left"/>
+            </w:pPr>
+            <w:r>
+              <w:rPr>
+                <w:b w:val="false"/>
+                <w:bCs w:val="false"/>
+                <w:color w:val="14274A"/>
+                <w:sz w:val="17"/>
+                <w:szCs w:val="17"/>
+              </w:rPr>
+              <w:t xml:space="preserve">4/5 · priority review on positive Ph2/3</w:t>
+            </w:r>
+          </w:p>
+        </w:tc>
+      </w:tr>
+      <w:tr>
+        <w:trPr>
+          <w:tblHeader w:val="false"/>
+        </w:trPr>
+        <w:tc>
+          <w:tcPr>
+            <w:tcW w:type="dxa" w:w="3250"/>
+            <w:tcBorders>
+              <w:top w:val="single" w:color="D6DEEA" w:sz="1"/>
+              <w:left w:val="single" w:color="D6DEEA" w:sz="1"/>
+              <w:bottom w:val="single" w:color="D6DEEA" w:sz="1"/>
+              <w:right w:val="single" w:color="D6DEEA" w:sz="1"/>
+            </w:tcBorders>
+            <w:shd w:fill="F5F8FF" w:val="clear"/>
+            <w:tcMar>
+              <w:top w:type="dxa" w:w="46"/>
+              <w:left w:type="dxa" w:w="94"/>
+              <w:bottom w:type="dxa" w:w="46"/>
+              <w:right w:type="dxa" w:w="94"/>
+            </w:tcMar>
+          </w:tcPr>
+          <w:p>
+            <w:pPr>
+              <w:jc w:val="left"/>
+            </w:pPr>
+            <w:r>
+              <w:rPr>
+                <w:b w:val="false"/>
+                <w:bCs w:val="false"/>
+                <w:color w:val="14274A"/>
+                <w:sz w:val="17"/>
+                <w:szCs w:val="17"/>
+              </w:rPr>
+              <w:t xml:space="preserve">IMVT-1402 reports a positive pivotal readout (any indication)</w:t>
+            </w:r>
+          </w:p>
+        </w:tc>
+        <w:tc>
+          <w:tcPr>
+            <w:tcW w:type="dxa" w:w="1150"/>
+            <w:tcBorders>
+              <w:top w:val="single" w:color="D6DEEA" w:sz="1"/>
+              <w:left w:val="single" w:color="D6DEEA" w:sz="1"/>
+              <w:bottom w:val="single" w:color="D6DEEA" w:sz="1"/>
+              <w:right w:val="single" w:color="D6DEEA" w:sz="1"/>
+            </w:tcBorders>
+            <w:shd w:fill="F5F8FF" w:val="clear"/>
+            <w:tcMar>
+              <w:top w:type="dxa" w:w="46"/>
+              <w:left w:type="dxa" w:w="94"/>
+              <w:bottom w:type="dxa" w:w="46"/>
+              <w:right w:type="dxa" w:w="94"/>
+            </w:tcMar>
+          </w:tcPr>
+          <w:p>
+            <w:pPr>
+              <w:jc w:val="left"/>
+            </w:pPr>
+            <w:r>
+              <w:rPr>
+                <w:b w:val="false"/>
+                <w:bCs w:val="false"/>
+                <w:color w:val="14274A"/>
+                <w:sz w:val="17"/>
+                <w:szCs w:val="17"/>
+              </w:rPr>
+              <w:t xml:space="preserve">outcome</w:t>
+            </w:r>
+          </w:p>
+        </w:tc>
+        <w:tc>
+          <w:tcPr>
+            <w:tcW w:type="dxa" w:w="1250"/>
+            <w:tcBorders>
+              <w:top w:val="single" w:color="D6DEEA" w:sz="1"/>
+              <w:left w:val="single" w:color="D6DEEA" w:sz="1"/>
+              <w:bottom w:val="single" w:color="D6DEEA" w:sz="1"/>
+              <w:right w:val="single" w:color="D6DEEA" w:sz="1"/>
+            </w:tcBorders>
+            <w:shd w:fill="F5F8FF" w:val="clear"/>
+            <w:tcMar>
+              <w:top w:type="dxa" w:w="46"/>
+              <w:left w:type="dxa" w:w="94"/>
+              <w:bottom w:type="dxa" w:w="46"/>
+              <w:right w:type="dxa" w:w="94"/>
+            </w:tcMar>
+          </w:tcPr>
+          <w:p>
+            <w:pPr>
+              <w:jc w:val="left"/>
+            </w:pPr>
+            <w:r>
+              <w:rPr>
+                <w:b w:val="false"/>
+                <w:bCs w:val="false"/>
+                <w:color w:val="14274A"/>
+                <w:sz w:val="17"/>
+                <w:szCs w:val="17"/>
+              </w:rPr>
+              <w:t xml:space="preserve">50%</w:t>
+            </w:r>
+          </w:p>
+        </w:tc>
+        <w:tc>
+          <w:tcPr>
+            <w:tcW w:type="dxa" w:w="1550"/>
+            <w:tcBorders>
+              <w:top w:val="single" w:color="D6DEEA" w:sz="1"/>
+              <w:left w:val="single" w:color="D6DEEA" w:sz="1"/>
+              <w:bottom w:val="single" w:color="D6DEEA" w:sz="1"/>
+              <w:right w:val="single" w:color="D6DEEA" w:sz="1"/>
+            </w:tcBorders>
+            <w:shd w:fill="F5F8FF" w:val="clear"/>
+            <w:tcMar>
+              <w:top w:type="dxa" w:w="46"/>
+              <w:left w:type="dxa" w:w="94"/>
+              <w:bottom w:type="dxa" w:w="46"/>
+              <w:right w:type="dxa" w:w="94"/>
+            </w:tcMar>
+          </w:tcPr>
+          <w:p>
+            <w:pPr>
+              <w:jc w:val="left"/>
+            </w:pPr>
+            <w:r>
+              <w:rPr>
+                <w:b w:val="false"/>
+                <w:bCs w:val="false"/>
+                <w:color w:val="14274A"/>
+                <w:sz w:val="17"/>
+                <w:szCs w:val="17"/>
+              </w:rPr>
+              <w:t xml:space="preserve">2027</w:t>
+            </w:r>
+          </w:p>
+        </w:tc>
+        <w:tc>
+          <w:tcPr>
+            <w:tcW w:type="dxa" w:w="2160"/>
+            <w:tcBorders>
+              <w:top w:val="single" w:color="D6DEEA" w:sz="1"/>
+              <w:left w:val="single" w:color="D6DEEA" w:sz="1"/>
+              <w:bottom w:val="single" w:color="D6DEEA" w:sz="1"/>
+              <w:right w:val="single" w:color="D6DEEA" w:sz="1"/>
+            </w:tcBorders>
+            <w:shd w:fill="F5F8FF" w:val="clear"/>
+            <w:tcMar>
+              <w:top w:type="dxa" w:w="46"/>
+              <w:left w:type="dxa" w:w="94"/>
+              <w:bottom w:type="dxa" w:w="46"/>
+              <w:right w:type="dxa" w:w="94"/>
+            </w:tcMar>
+          </w:tcPr>
+          <w:p>
+            <w:pPr>
+              <w:jc w:val="left"/>
+            </w:pPr>
+            <w:r>
+              <w:rPr>
+                <w:b w:val="false"/>
+                <w:bCs w:val="false"/>
+                <w:color w:val="14274A"/>
+                <w:sz w:val="17"/>
+                <w:szCs w:val="17"/>
+              </w:rPr>
+              <w:t xml:space="preserve">2/5 · clean profile, but Graves data slipped</w:t>
+            </w:r>
+          </w:p>
+        </w:tc>
+      </w:tr>
+      <w:tr>
+        <w:trPr>
+          <w:tblHeader w:val="false"/>
+        </w:trPr>
+        <w:tc>
+          <w:tcPr>
+            <w:tcW w:type="dxa" w:w="3250"/>
+            <w:tcBorders>
+              <w:top w:val="single" w:color="D6DEEA" w:sz="1"/>
+              <w:left w:val="single" w:color="D6DEEA" w:sz="1"/>
+              <w:bottom w:val="single" w:color="D6DEEA" w:sz="1"/>
+              <w:right w:val="single" w:color="D6DEEA" w:sz="1"/>
+            </w:tcBorders>
+            <w:shd w:fill="FFFFFF" w:val="clear"/>
+            <w:tcMar>
+              <w:top w:type="dxa" w:w="46"/>
+              <w:left w:type="dxa" w:w="94"/>
+              <w:bottom w:type="dxa" w:w="46"/>
+              <w:right w:type="dxa" w:w="94"/>
+            </w:tcMar>
+          </w:tcPr>
+          <w:p>
+            <w:pPr>
+              <w:jc w:val="left"/>
+            </w:pPr>
+            <w:r>
+              <w:rPr>
+                <w:b w:val="false"/>
+                <w:bCs w:val="false"/>
+                <w:color w:val="14274A"/>
+                <w:sz w:val="17"/>
+                <w:szCs w:val="17"/>
+              </w:rPr>
+              <w:t xml:space="preserve">A first extended-half-life FcRn inhibitor reaches the clinic</w:t>
+            </w:r>
+          </w:p>
+        </w:tc>
+        <w:tc>
+          <w:tcPr>
+            <w:tcW w:type="dxa" w:w="1150"/>
+            <w:tcBorders>
+              <w:top w:val="single" w:color="D6DEEA" w:sz="1"/>
+              <w:left w:val="single" w:color="D6DEEA" w:sz="1"/>
+              <w:bottom w:val="single" w:color="D6DEEA" w:sz="1"/>
+              <w:right w:val="single" w:color="D6DEEA" w:sz="1"/>
+            </w:tcBorders>
+            <w:shd w:fill="FFFFFF" w:val="clear"/>
+            <w:tcMar>
+              <w:top w:type="dxa" w:w="46"/>
+              <w:left w:type="dxa" w:w="94"/>
+              <w:bottom w:type="dxa" w:w="46"/>
+              <w:right w:type="dxa" w:w="94"/>
+            </w:tcMar>
+          </w:tcPr>
+          <w:p>
+            <w:pPr>
+              <w:jc w:val="left"/>
+            </w:pPr>
+            <w:r>
+              <w:rPr>
+                <w:b w:val="false"/>
+                <w:bCs w:val="false"/>
+                <w:color w:val="14274A"/>
+                <w:sz w:val="17"/>
+                <w:szCs w:val="17"/>
+              </w:rPr>
+              <w:t xml:space="preserve">first-to-clinic</w:t>
+            </w:r>
+          </w:p>
+        </w:tc>
+        <w:tc>
+          <w:tcPr>
+            <w:tcW w:type="dxa" w:w="1250"/>
+            <w:tcBorders>
+              <w:top w:val="single" w:color="D6DEEA" w:sz="1"/>
+              <w:left w:val="single" w:color="D6DEEA" w:sz="1"/>
+              <w:bottom w:val="single" w:color="D6DEEA" w:sz="1"/>
+              <w:right w:val="single" w:color="D6DEEA" w:sz="1"/>
+            </w:tcBorders>
+            <w:shd w:fill="FFFFFF" w:val="clear"/>
+            <w:tcMar>
+              <w:top w:type="dxa" w:w="46"/>
+              <w:left w:type="dxa" w:w="94"/>
+              <w:bottom w:type="dxa" w:w="46"/>
+              <w:right w:type="dxa" w:w="94"/>
+            </w:tcMar>
+          </w:tcPr>
+          <w:p>
+            <w:pPr>
+              <w:jc w:val="left"/>
+            </w:pPr>
+            <w:r>
+              <w:rPr>
+                <w:b w:val="false"/>
+                <w:bCs w:val="false"/>
+                <w:color w:val="14274A"/>
+                <w:sz w:val="17"/>
+                <w:szCs w:val="17"/>
+              </w:rPr>
+              <w:t xml:space="preserve">45-55%</w:t>
+            </w:r>
+          </w:p>
+        </w:tc>
+        <w:tc>
+          <w:tcPr>
+            <w:tcW w:type="dxa" w:w="1550"/>
+            <w:tcBorders>
+              <w:top w:val="single" w:color="D6DEEA" w:sz="1"/>
+              <w:left w:val="single" w:color="D6DEEA" w:sz="1"/>
+              <w:bottom w:val="single" w:color="D6DEEA" w:sz="1"/>
+              <w:right w:val="single" w:color="D6DEEA" w:sz="1"/>
+            </w:tcBorders>
+            <w:shd w:fill="FFFFFF" w:val="clear"/>
+            <w:tcMar>
+              <w:top w:type="dxa" w:w="46"/>
+              <w:left w:type="dxa" w:w="94"/>
+              <w:bottom w:type="dxa" w:w="46"/>
+              <w:right w:type="dxa" w:w="94"/>
+            </w:tcMar>
+          </w:tcPr>
+          <w:p>
+            <w:pPr>
+              <w:jc w:val="left"/>
+            </w:pPr>
+            <w:r>
+              <w:rPr>
+                <w:b w:val="false"/>
+                <w:bCs w:val="false"/>
+                <w:color w:val="14274A"/>
+                <w:sz w:val="17"/>
+                <w:szCs w:val="17"/>
+              </w:rPr>
+              <w:t xml:space="preserve">2026 – 2027</w:t>
+            </w:r>
+          </w:p>
+        </w:tc>
+        <w:tc>
+          <w:tcPr>
+            <w:tcW w:type="dxa" w:w="2160"/>
+            <w:tcBorders>
+              <w:top w:val="single" w:color="D6DEEA" w:sz="1"/>
+              <w:left w:val="single" w:color="D6DEEA" w:sz="1"/>
+              <w:bottom w:val="single" w:color="D6DEEA" w:sz="1"/>
+              <w:right w:val="single" w:color="D6DEEA" w:sz="1"/>
+            </w:tcBorders>
+            <w:shd w:fill="FFFFFF" w:val="clear"/>
+            <w:tcMar>
+              <w:top w:type="dxa" w:w="46"/>
+              <w:left w:type="dxa" w:w="94"/>
+              <w:bottom w:type="dxa" w:w="46"/>
+              <w:right w:type="dxa" w:w="94"/>
+            </w:tcMar>
+          </w:tcPr>
+          <w:p>
+            <w:pPr>
+              <w:jc w:val="left"/>
+            </w:pPr>
+            <w:r>
+              <w:rPr>
+                <w:b w:val="false"/>
+                <w:bCs w:val="false"/>
+                <w:color w:val="14274A"/>
+                <w:sz w:val="17"/>
+                <w:szCs w:val="17"/>
+              </w:rPr>
+              <w:t xml:space="preserve">2/5 · engineering rationale; dosing-floor risk</w:t>
+            </w:r>
+          </w:p>
+        </w:tc>
+      </w:tr>
+      <w:tr>
+        <w:trPr>
+          <w:tblHeader w:val="false"/>
+        </w:trPr>
+        <w:tc>
+          <w:tcPr>
+            <w:tcW w:type="dxa" w:w="3250"/>
+            <w:tcBorders>
+              <w:top w:val="single" w:color="D6DEEA" w:sz="1"/>
+              <w:left w:val="single" w:color="D6DEEA" w:sz="1"/>
+              <w:bottom w:val="single" w:color="D6DEEA" w:sz="1"/>
+              <w:right w:val="single" w:color="D6DEEA" w:sz="1"/>
+            </w:tcBorders>
+            <w:shd w:fill="F5F8FF" w:val="clear"/>
+            <w:tcMar>
+              <w:top w:type="dxa" w:w="46"/>
+              <w:left w:type="dxa" w:w="94"/>
+              <w:bottom w:type="dxa" w:w="46"/>
+              <w:right w:type="dxa" w:w="94"/>
+            </w:tcMar>
+          </w:tcPr>
+          <w:p>
+            <w:pPr>
+              <w:jc w:val="left"/>
+            </w:pPr>
+            <w:r>
+              <w:rPr>
                 <w:b w:val="false"/>
                 <w:bCs w:val="false"/>
                 <w:color w:val="14274A"/>
@@ -8313,7 +8989,7 @@
         </w:tc>
         <w:tc>
           <w:tcPr>
-            <w:tcW w:type="dxa" w:w="1500"/>
+            <w:tcW w:type="dxa" w:w="1150"/>
             <w:tcBorders>
               <w:top w:val="single" w:color="D6DEEA" w:sz="1"/>
               <w:left w:val="single" w:color="D6DEEA" w:sz="1"/>
@@ -8346,7 +9022,7 @@
         </w:tc>
         <w:tc>
           <w:tcPr>
-            <w:tcW w:type="dxa" w:w="1500"/>
+            <w:tcW w:type="dxa" w:w="1250"/>
             <w:tcBorders>
               <w:top w:val="single" w:color="D6DEEA" w:sz="1"/>
               <w:left w:val="single" w:color="D6DEEA" w:sz="1"/>
@@ -8379,7 +9055,7 @@
         </w:tc>
         <w:tc>
           <w:tcPr>
-            <w:tcW w:type="dxa" w:w="1760"/>
+            <w:tcW w:type="dxa" w:w="1550"/>
             <w:tcBorders>
               <w:top w:val="single" w:color="D6DEEA" w:sz="1"/>
               <w:left w:val="single" w:color="D6DEEA" w:sz="1"/>
@@ -8407,6 +9083,39 @@
                 <w:szCs w:val="17"/>
               </w:rPr>
               <w:t xml:space="preserve">2026 – 2027</w:t>
+            </w:r>
+          </w:p>
+        </w:tc>
+        <w:tc>
+          <w:tcPr>
+            <w:tcW w:type="dxa" w:w="2160"/>
+            <w:tcBorders>
+              <w:top w:val="single" w:color="D6DEEA" w:sz="1"/>
+              <w:left w:val="single" w:color="D6DEEA" w:sz="1"/>
+              <w:bottom w:val="single" w:color="D6DEEA" w:sz="1"/>
+              <w:right w:val="single" w:color="D6DEEA" w:sz="1"/>
+            </w:tcBorders>
+            <w:shd w:fill="F5F8FF" w:val="clear"/>
+            <w:tcMar>
+              <w:top w:type="dxa" w:w="46"/>
+              <w:left w:type="dxa" w:w="94"/>
+              <w:bottom w:type="dxa" w:w="46"/>
+              <w:right w:type="dxa" w:w="94"/>
+            </w:tcMar>
+          </w:tcPr>
+          <w:p>
+            <w:pPr>
+              <w:jc w:val="left"/>
+            </w:pPr>
+            <w:r>
+              <w:rPr>
+                <w:b w:val="false"/>
+                <w:bCs w:val="false"/>
+                <w:color w:val="14274A"/>
+                <w:sz w:val="17"/>
+                <w:szCs w:val="17"/>
+              </w:rPr>
+              <w:t xml:space="preserve">4/5 · multiple active filings (wAIHA, ITP)</w:t>
             </w:r>
           </w:p>
         </w:tc>

</xml_diff>

<commit_message>
AIB rigor round 2 (ChatGPT): free-combination 'real comparator' callouts (TSLP, IL-4Ra); 'biologics in a Rinvoq world' framing (IL-4Ra); IGF-1R-captures-most-signaling as the headline counterargument (IGF-1R); minimum-FcRn-occupancy + CAR-T-as-cure threat elevated (FcRn)
</commit_message>
<xml_diff>
--- a/AIB_FcRn_Albumin_autoimmune_v1.docx
+++ b/AIB_FcRn_Albumin_autoimmune_v1.docx
@@ -1010,7 +1010,7 @@
       <w:r>
         <w:t xml:space="preserve">With three approved FcRn inhibitors at similar efficacy, the class has moved from 'does it work?' to 'how convenient and how broad?' </w:t>
       </w:r>
-      <w:hyperlink w:history="1" r:id="rIdaogbgwjmt7qifimfgosmk">
+      <w:hyperlink w:history="1" r:id="rId5siyj8ju_npzwr1ctryho">
         <w:r>
           <w:rPr>
             <w:rStyle w:val="Hyperlink"/>
@@ -1021,7 +1021,7 @@
       <w:r>
         <w:t xml:space="preserve">; the live battleground is </w:t>
       </w:r>
-      <w:hyperlink w:history="1" r:id="rIdf8iphkiwisd-sw5epvxdg">
+      <w:hyperlink w:history="1" r:id="rIdh-72xtktzc-flrhc2n3zy">
         <w:r>
           <w:rPr>
             <w:rStyle w:val="Hyperlink"/>
@@ -1043,6 +1043,73 @@
         <w:t xml:space="preserve">, engineered for deep IgG lowering with a cleaner albumin/lipid profile than batoclimab and SC dosing — it is already pursuing the convenience differentiation, and is the benchmark a new entrant must beat, not just the approved agents.</w:t>
       </w:r>
     </w:p>
+    <w:tbl>
+      <w:tblPr>
+        <w:tblW w:type="dxa" w:w="9360"/>
+        <w:tblBorders>
+          <w:top w:val="single" w:color="auto" w:sz="4"/>
+          <w:left w:val="single" w:color="auto" w:sz="4"/>
+          <w:bottom w:val="single" w:color="auto" w:sz="4"/>
+          <w:right w:val="single" w:color="auto" w:sz="4"/>
+          <w:insideH w:val="single" w:color="auto" w:sz="4"/>
+          <w:insideV w:val="single" w:color="auto" w:sz="4"/>
+        </w:tblBorders>
+      </w:tblPr>
+      <w:tblGrid>
+        <w:gridCol w:w="9360"/>
+      </w:tblGrid>
+      <w:tr>
+        <w:tc>
+          <w:tcPr>
+            <w:tcBorders>
+              <w:top w:val="none"/>
+              <w:left w:val="single" w:color="1A3F8F" w:sz="18"/>
+              <w:bottom w:val="none"/>
+              <w:right w:val="none"/>
+            </w:tcBorders>
+            <w:shd w:fill="EEF4FB" w:val="clear"/>
+            <w:tcMar>
+              <w:top w:type="dxa" w:w="80"/>
+              <w:left w:type="dxa" w:w="150"/>
+              <w:bottom w:type="dxa" w:w="80"/>
+              <w:right w:type="dxa" w:w="130"/>
+            </w:tcMar>
+          </w:tcPr>
+          <w:p>
+            <w:r>
+              <w:rPr>
+                <w:b/>
+                <w:bCs/>
+              </w:rPr>
+              <w:t xml:space="preserve">Two questions sit above all others. </w:t>
+            </w:r>
+            <w:r>
+              <w:t xml:space="preserve">First, the </w:t>
+            </w:r>
+            <w:r>
+              <w:rPr>
+                <w:b/>
+                <w:bCs/>
+              </w:rPr>
+              <w:t xml:space="preserve">central scientific uncertainty is not 'can we extend half-life' but the minimum effective FcRn occupancy (and depth of IgG suppression) that sustains clinical benefit</w:t>
+            </w:r>
+            <w:r>
+              <w:t xml:space="preserve"> — that pharmacodynamic threshold, not circulating half-life, decides whether infrequent dosing is even achievable. Second, the largest strategic threat is not another FcRn inhibitor or complement agent but </w:t>
+            </w:r>
+            <w:r>
+              <w:rPr>
+                <w:b/>
+                <w:bCs/>
+              </w:rPr>
+              <w:t xml:space="preserve">one-time B-cell / CAR-T immune reset</w:t>
+            </w:r>
+            <w:r>
+              <w:t xml:space="preserve">: if a single administration delivers durable, drug-free remission, the entire chronic-FcRn model — however convenient — is disrupted. A monthly FcRn competes, ultimately, against a potential cure.</w:t>
+            </w:r>
+          </w:p>
+        </w:tc>
+      </w:tr>
+    </w:tbl>
     <w:p>
       <w:pPr>
         <w:pStyle w:val="Heading1"/>
@@ -1058,7 +1125,7 @@
       <w:r>
         <w:t xml:space="preserve">Generalized myasthenia gravis is the anchor indication: autoantibodies (mostly against the acetylcholine receptor, </w:t>
       </w:r>
-      <w:hyperlink w:history="1" r:id="rIdsrem-eals64ju2nh4rbfd">
+      <w:hyperlink w:history="1" r:id="rId5ocfcxnwe1rwylkcnebbn">
         <w:r>
           <w:rPr>
             <w:rStyle w:val="Hyperlink"/>
@@ -1499,7 +1566,7 @@
       <w:r>
         <w:t xml:space="preserve">FcRn (the </w:t>
       </w:r>
-      <w:hyperlink w:history="1" r:id="rId5cm9ri28udvhqs_tmnmlg">
+      <w:hyperlink w:history="1" r:id="rIdaq-wdh1emnptkpwblsbga">
         <w:r>
           <w:rPr>
             <w:rStyle w:val="Hyperlink"/>
@@ -1546,7 +1613,7 @@
       <w:r>
         <w:t xml:space="preserve">The mechanism is decisively validated — </w:t>
       </w:r>
-      <w:hyperlink w:history="1" r:id="rIdag8xzpgnjyhcw1zsjc92n">
+      <w:hyperlink w:history="1" r:id="rIdmnlaobbto_gyjezelaygn">
         <w:r>
           <w:rPr>
             <w:rStyle w:val="Hyperlink"/>
@@ -1557,7 +1624,7 @@
       <w:r>
         <w:t xml:space="preserve">, matched by rozanolixizumab and nipocalimab, and expanding into CIDP, ITP and wAIHA. What is not solved is convenience: every approved agent requires </w:t>
       </w:r>
-      <w:hyperlink w:history="1" r:id="rIdhyociwoh5xzrjm77kvtqd">
+      <w:hyperlink w:history="1" r:id="rIdpx6udr70mlmqm0t_294yl">
         <w:r>
           <w:rPr>
             <w:rStyle w:val="Hyperlink"/>
@@ -2715,7 +2782,7 @@
             <w:r>
               <w:t xml:space="preserve">The approved standard is </w:t>
             </w:r>
-            <w:hyperlink w:history="1" r:id="rId6n8q4qt5nctv_9fyxqtfq">
+            <w:hyperlink w:history="1" r:id="rIdq_srodx9fl5yz8fpvvfcs">
               <w:r>
                 <w:rPr>
                   <w:rStyle w:val="Hyperlink"/>
@@ -4396,7 +4463,7 @@
         </w:rPr>
         <w:t xml:space="preserve">Indication-specific failure is real. </w:t>
       </w:r>
-      <w:hyperlink w:history="1" r:id="rIdkduq66gnzfsc4uu7w49wt">
+      <w:hyperlink w:history="1" r:id="rIdkrvbnudpvfskgd56hlyif">
         <w:r>
           <w:rPr>
             <w:rStyle w:val="Hyperlink"/>
@@ -5598,7 +5665,7 @@
       <w:r>
         <w:t xml:space="preserve">FcRn inhibitors carry high annual costs typical of rare-disease biologics, and the </w:t>
       </w:r>
-      <w:hyperlink w:history="1" r:id="rIda3-cqcng67-rwjchon2lz">
+      <w:hyperlink w:history="1" r:id="rIdwofa8sg6gt8rak2kndz51">
         <w:r>
           <w:rPr>
             <w:rStyle w:val="Hyperlink"/>

</xml_diff>